<commit_message>
docs: add gated review signal question and candidate review sources
Adds an exploratory question on whether dated customer complaints
precede recalls, with a Week 2 overlap gate. Lists the review sources
checked and the first brand-name probe. Matching stays the main
contribution. Updates the README, notebook plan sections, Week 1
report and submission text.
</commit_message>
<xml_diff>
--- a/submissions/week_01/Week_01_Cosmetic_Recall_Problem_Definition.docx
+++ b/submissions/week_01/Week_01_Cosmetic_Recall_Problem_Definition.docx
@@ -42,6 +42,11 @@
     <w:p>
       <w:r>
         <w:t>The feasibility work supports a limited study, with important data constraints. The French snapshot contains 296 cosmetic notices. An independent catalogue overlaps 30 product identities, but only 17 have usable names. A small comparison exposed a concrete error: both text methods ranked a 300 ml shampoo recall ahead of the barcode-linked 250 ml recall. The bottles have different barcodes and batches. These results justify investigating variant confusion, not claiming that a reliable public safety service has been built.</w:t>
+      </w:r>
+    </w:p>
+    <w:p>
+      <w:r>
+        <w:t>A second, exploratory question is whether dated customer complaints could have pointed to a product before its recall. Health Canada's 2025 notice for amika Mirrorball shampoo records 48 reports of foul odour and two reports of irritation or allergic reaction received by the company. [11] This question is gated: it continues beyond a single case study only if enough recalled products have dated reviews written before their notice. Product and batch matching remains the main contribution.</w:t>
       </w:r>
     </w:p>
     <w:p>
@@ -1411,6 +1416,19 @@
         <w:pStyle w:val="Heading2"/>
       </w:pPr>
       <w:r>
+        <w:t>Question five Early complaint signals</w:t>
+      </w:r>
+    </w:p>
+    <w:p>
+      <w:r>
+        <w:t>Could repeated complaints about smell, irritation or texture in dated customer feedback have indicated a product before its recall was published? Hypothesis H5, exploratory: for recalled products with earlier dated reviews, the share of reviews mentioning these complaints rises before the notice more than it does for comparable products that were not recalled. Test this only if at least 20 recalled products have reviews dated before their notice; otherwise report a single case study. Twenty is a planning threshold, not a power calculation. A review pattern is a prompt for investigation, not evidence that a product is unsafe or that it caused a reaction.</w:t>
+      </w:r>
+    </w:p>
+    <w:p>
+      <w:pPr>
+        <w:pStyle w:val="Heading2"/>
+      </w:pPr>
+      <w:r>
         <w:t>What would count as success</w:t>
       </w:r>
     </w:p>
@@ -2364,6 +2382,11 @@
     </w:p>
     <w:p>
       <w:r>
+        <w:t>For the exploratory review question, candidate sources were checked on 2 October 2026. Amazon Reviews 2023 holds 23.9 million dated ratings for beauty and personal care items up to September 2023. It has not been downloaded or measured, and its project page states no licence. [12] The openFDA cosmetic adverse event data holds 85,511 dated reports sent to the United States regulator. These are reports, not reviews, and a report does not establish causation. [13] A Sephora review dataset on Kaggle, used in earlier work, covers a United States retailer. In a first brand-name probe, run outside the notebook and not reviewed, none of the 173 brand names in the French notices matched the Sephora product list, and 12 appeared in openFDA product names, some of them ordinary words. No open, dated French-language review source for the recalled products was found. With the data in hand, the French notices cannot support a review-signal test, so Week 2 measures product-level overlap with Amazon Reviews 2023 before any modelling.</w:t>
+      </w:r>
+    </w:p>
+    <w:p>
+      <w:r>
         <w:br w:type="page"/>
       </w:r>
     </w:p>
@@ -3158,6 +3181,86 @@
           </w:p>
         </w:tc>
       </w:tr>
+      <w:tr>
+        <w:trPr>
+          <w:cantSplit/>
+        </w:trPr>
+        <w:tc>
+          <w:tcPr>
+            <w:tcW w:type="dxa" w:w="2448"/>
+            <w:vAlign w:val="center"/>
+            <w:shd w:fill="F5F7F8"/>
+            <w:tcMar>
+              <w:top w:w="90" w:type="dxa"/>
+              <w:left w:w="90" w:type="dxa"/>
+              <w:bottom w:w="90" w:type="dxa"/>
+              <w:right w:w="90" w:type="dxa"/>
+            </w:tcMar>
+          </w:tcPr>
+          <w:p>
+            <w:pPr>
+              <w:spacing w:after="40" w:before="40" w:line="245" w:lineRule="auto"/>
+            </w:pPr>
+            <w:r>
+              <w:rPr>
+                <w:b w:val="0"/>
+                <w:sz w:val="20"/>
+              </w:rPr>
+              <w:t>Self-selected reviews and complaints</w:t>
+            </w:r>
+          </w:p>
+        </w:tc>
+        <w:tc>
+          <w:tcPr>
+            <w:tcW w:type="dxa" w:w="3672"/>
+            <w:vAlign w:val="center"/>
+            <w:shd w:fill="F5F7F8"/>
+            <w:tcMar>
+              <w:top w:w="90" w:type="dxa"/>
+              <w:left w:w="90" w:type="dxa"/>
+              <w:bottom w:w="90" w:type="dxa"/>
+              <w:right w:w="90" w:type="dxa"/>
+            </w:tcMar>
+          </w:tcPr>
+          <w:p>
+            <w:pPr>
+              <w:spacing w:after="40" w:before="40" w:line="245" w:lineRule="auto"/>
+            </w:pPr>
+            <w:r>
+              <w:rPr>
+                <w:b w:val="0"/>
+                <w:sz w:val="20"/>
+              </w:rPr>
+              <w:t>Treat patterns as prompts for investigation; compare with products not recalled</w:t>
+            </w:r>
+          </w:p>
+        </w:tc>
+        <w:tc>
+          <w:tcPr>
+            <w:tcW w:type="dxa" w:w="3629"/>
+            <w:vAlign w:val="center"/>
+            <w:shd w:fill="F5F7F8"/>
+            <w:tcMar>
+              <w:top w:w="90" w:type="dxa"/>
+              <w:left w:w="90" w:type="dxa"/>
+              <w:bottom w:w="90" w:type="dxa"/>
+              <w:right w:w="90" w:type="dxa"/>
+            </w:tcMar>
+          </w:tcPr>
+          <w:p>
+            <w:pPr>
+              <w:spacing w:after="40" w:before="40" w:line="245" w:lineRule="auto"/>
+            </w:pPr>
+            <w:r>
+              <w:rPr>
+                <w:b w:val="0"/>
+                <w:sz w:val="20"/>
+              </w:rPr>
+              <w:t>No causal claim; reviewers differ from all users</w:t>
+            </w:r>
+          </w:p>
+        </w:tc>
+      </w:tr>
     </w:tbl>
     <w:p>
       <w:pPr>
@@ -3451,7 +3554,7 @@
                 <w:b w:val="0"/>
                 <w:sz w:val="20"/>
               </w:rPr>
-              <w:t>Source comparison, access and licences, coverage and label plan</w:t>
+              <w:t>Source comparison, access and licences, coverage, label plan and review-data overlap gate</w:t>
             </w:r>
           </w:p>
         </w:tc>
@@ -3831,7 +3934,7 @@
     </w:p>
     <w:p>
       <w:r>
-        <w:t>Review the 30 overlapping product identities and the highest-scoring unlinked suggestions, retaining source evidence for each label. Expand confusing variants and complex batch cases before selecting a semantic model. Prepare separate weekly reports as this work progresses and link the technical project repository after its contents have been verified.</w:t>
+        <w:t>Review the 30 overlapping product identities and the highest-scoring unlinked suggestions, retaining source evidence for each label. Expand confusing variants and complex batch cases before selecting a semantic model. Prepare separate weekly reports as this work progresses and link the technical project repository after its contents have been verified. In Week 2, measure how many recalled products have reviews dated before their notice in Amazon Reviews 2023 and apply the review-signal gate.</w:t>
       </w:r>
     </w:p>
     <w:p>
@@ -4131,6 +4234,63 @@
       </w:hyperlink>
       <w:r>
         <w:t>. Notice 2026-08-0072, published 14 August 2026. Source review for product description, lot location and instructions.</w:t>
+      </w:r>
+    </w:p>
+    <w:p>
+      <w:r>
+        <w:rPr>
+          <w:b/>
+        </w:rPr>
+        <w:t xml:space="preserve">[11] </w:t>
+      </w:r>
+      <w:hyperlink r:id="rId21">
+        <w:r>
+          <w:rPr>
+            <w:color w:val="175675"/>
+          </w:rPr>
+          <w:t>Health Canada amika Mirrorball shampoo recall</w:t>
+        </w:r>
+      </w:hyperlink>
+      <w:r>
+        <w:t>. Consumer product recall, 2025. Units sold in Canada and reports received by the company; motivation for the exploratory review question.</w:t>
+      </w:r>
+    </w:p>
+    <w:p>
+      <w:r>
+        <w:rPr>
+          <w:b/>
+        </w:rPr>
+        <w:t xml:space="preserve">[12] </w:t>
+      </w:r>
+      <w:hyperlink r:id="rId22">
+        <w:r>
+          <w:rPr>
+            <w:color w:val="175675"/>
+          </w:rPr>
+          <w:t>McAuley Lab Amazon Reviews 2023</w:t>
+        </w:r>
+      </w:hyperlink>
+      <w:r>
+        <w:t>. Dated product reviews to September 2023. Candidate review source; not yet downloaded or measured.</w:t>
+      </w:r>
+    </w:p>
+    <w:p>
+      <w:r>
+        <w:rPr>
+          <w:b/>
+        </w:rPr>
+        <w:t xml:space="preserve">[13] </w:t>
+      </w:r>
+      <w:hyperlink r:id="rId23">
+        <w:r>
+          <w:rPr>
+            <w:color w:val="175675"/>
+          </w:rPr>
+          <w:t>openFDA cosmetic adverse event API</w:t>
+        </w:r>
+      </w:hyperlink>
+      <w:r>
+        <w:t>. Dated reports submitted to the United States Food and Drug Administration. A report does not establish causation.</w:t>
       </w:r>
     </w:p>
     <w:sectPr>

</xml_diff>